<commit_message>
Resume: Risk Analyst @ Unknown (unknown)
</commit_message>
<xml_diff>
--- a/resumes/Resume_Risk_Analyst_Unknown__unknown_.docx
+++ b/resumes/Resume_Risk_Analyst_Unknown__unknown_.docx
@@ -117,7 +117,7 @@
         <w:pBdr>
           <w:bottom w:val="single" w:sz="6" w:space="1" w:color="000000"/>
         </w:pBdr>
-        <w:spacing w:before="148" w:after="0"/>
+        <w:spacing w:before="42" w:after="0"/>
       </w:pPr>
       <w:r>
         <w:rPr>
@@ -295,7 +295,7 @@
     </w:p>
     <w:p>
       <w:pPr>
-        <w:spacing w:before="32" w:after="32"/>
+        <w:spacing w:before="5" w:after="5"/>
       </w:pPr>
     </w:p>
     <w:p>
@@ -303,7 +303,7 @@
         <w:pBdr>
           <w:bottom w:val="single" w:sz="6" w:space="1" w:color="000000"/>
         </w:pBdr>
-        <w:spacing w:before="148" w:after="0"/>
+        <w:spacing w:before="42" w:after="0"/>
       </w:pPr>
       <w:r>
         <w:rPr>
@@ -421,16 +421,16 @@
           <w:ilvl w:val="0"/>
           <w:numId w:val="2"/>
         </w:numPr>
-        <w:spacing w:before="13" w:after="40"/>
-      </w:pPr>
-      <w:r>
-        <w:rPr>
-          <w:rFonts w:ascii="Source Sans Pro" w:eastAsia="Source Sans Pro" w:hAnsi="Source Sans Pro" w:cs="Source Sans Pro"/>
-          <w:color w:val="000000"/>
-          <w:sz w:val="19"/>
-          <w:szCs w:val="19"/>
-        </w:rPr>
-        <w:t>Triaged 50+ weekly inventory reimbursement cases by severity and policy eligibility, translating high-volume case review into control evidence, compliance tracking, and decision trails.</w:t>
+        <w:spacing w:before="13" w:after="17"/>
+      </w:pPr>
+      <w:r>
+        <w:rPr>
+          <w:rFonts w:ascii="Source Sans Pro" w:eastAsia="Source Sans Pro" w:hAnsi="Source Sans Pro" w:cs="Source Sans Pro"/>
+          <w:color w:val="000000"/>
+          <w:sz w:val="19"/>
+          <w:szCs w:val="19"/>
+        </w:rPr>
+        <w:t>Triaged 50+ weekly inventory reimbursement cases by severity and policy eligibility, reducing risk</w:t>
       </w:r>
     </w:p>
     <w:p>
@@ -440,16 +440,16 @@
           <w:ilvl w:val="0"/>
           <w:numId w:val="2"/>
         </w:numPr>
-        <w:spacing w:before="13" w:after="40"/>
-      </w:pPr>
-      <w:r>
-        <w:rPr>
-          <w:rFonts w:ascii="Source Sans Pro" w:eastAsia="Source Sans Pro" w:hAnsi="Source Sans Pro" w:cs="Source Sans Pro"/>
-          <w:color w:val="000000"/>
-          <w:sz w:val="19"/>
-          <w:szCs w:val="19"/>
-        </w:rPr>
-        <w:t>Conducted root cause analysis on seller claims, identifying policy violations and anomalous patterns for pattern review and investigation handoffs.</w:t>
+        <w:spacing w:before="13" w:after="17"/>
+      </w:pPr>
+      <w:r>
+        <w:rPr>
+          <w:rFonts w:ascii="Source Sans Pro" w:eastAsia="Source Sans Pro" w:hAnsi="Source Sans Pro" w:cs="Source Sans Pro"/>
+          <w:color w:val="000000"/>
+          <w:sz w:val="19"/>
+          <w:szCs w:val="19"/>
+        </w:rPr>
+        <w:t>Investigated seller claims, identifying policy violations and anomalous patterns, escalating risk findings</w:t>
       </w:r>
     </w:p>
     <w:p>
@@ -459,7 +459,7 @@
           <w:ilvl w:val="0"/>
           <w:numId w:val="2"/>
         </w:numPr>
-        <w:spacing w:before="13" w:after="40"/>
+        <w:spacing w:before="13" w:after="17"/>
       </w:pPr>
       <w:r>
         <w:rPr>
@@ -478,16 +478,16 @@
           <w:ilvl w:val="0"/>
           <w:numId w:val="2"/>
         </w:numPr>
-        <w:spacing w:before="13" w:after="40"/>
-      </w:pPr>
-      <w:r>
-        <w:rPr>
-          <w:rFonts w:ascii="Source Sans Pro" w:eastAsia="Source Sans Pro" w:hAnsi="Source Sans Pro" w:cs="Source Sans Pro"/>
-          <w:color w:val="000000"/>
-          <w:sz w:val="19"/>
-          <w:szCs w:val="19"/>
-        </w:rPr>
-        <w:t>Spotted recurring fraud patterns across 200+ weekly cases and flagged repeat issues early, reducing investigation cycles before escalation.</w:t>
+        <w:spacing w:before="13" w:after="17"/>
+      </w:pPr>
+      <w:r>
+        <w:rPr>
+          <w:rFonts w:ascii="Source Sans Pro" w:eastAsia="Source Sans Pro" w:hAnsi="Source Sans Pro" w:cs="Source Sans Pro"/>
+          <w:color w:val="000000"/>
+          <w:sz w:val="19"/>
+          <w:szCs w:val="19"/>
+        </w:rPr>
+        <w:t>Spotted recurring fraud patterns across 200+ weekly cases, reducing repeat-issue investigation time and risk</w:t>
       </w:r>
     </w:p>
     <w:p>
@@ -495,7 +495,7 @@
         <w:pBdr>
           <w:bottom w:val="single" w:sz="6" w:space="1" w:color="000000"/>
         </w:pBdr>
-        <w:spacing w:before="32" w:after="32"/>
+        <w:spacing w:before="5" w:after="5"/>
         <w:rPr>
           <w:rFonts w:ascii="Source Sans Pro" w:eastAsia="Source Sans Pro" w:hAnsi="Source Sans Pro" w:cs="Source Sans Pro"/>
           <w:b/>
@@ -511,7 +511,7 @@
         <w:pBdr>
           <w:bottom w:val="single" w:sz="6" w:space="1" w:color="000000"/>
         </w:pBdr>
-        <w:spacing w:before="148" w:after="0"/>
+        <w:spacing w:before="42" w:after="0"/>
       </w:pPr>
       <w:r>
         <w:rPr>
@@ -579,16 +579,16 @@
           <w:ilvl w:val="0"/>
           <w:numId w:val="2"/>
         </w:numPr>
-        <w:spacing w:before="13" w:after="40"/>
-      </w:pPr>
-      <w:r>
-        <w:rPr>
-          <w:rFonts w:ascii="Source Sans Pro" w:eastAsia="Source Sans Pro" w:hAnsi="Source Sans Pro" w:cs="Source Sans Pro"/>
-          <w:color w:val="000000"/>
-          <w:sz w:val="19"/>
-          <w:szCs w:val="19"/>
-        </w:rPr>
-        <w:t>Deployed Splunk SIEM for risk identification and threat detection, creating audit trails with SPL correlation searches for brute-force detection.</w:t>
+        <w:spacing w:before="13" w:after="17"/>
+      </w:pPr>
+      <w:r>
+        <w:rPr>
+          <w:rFonts w:ascii="Source Sans Pro" w:eastAsia="Source Sans Pro" w:hAnsi="Source Sans Pro" w:cs="Source Sans Pro"/>
+          <w:color w:val="000000"/>
+          <w:sz w:val="19"/>
+          <w:szCs w:val="19"/>
+        </w:rPr>
+        <w:t>Deployed Splunk SIEM for threat detection (anomaly detection) and incident response in risk arena, creating audit trails with decision notes and corrective actions, resulting in a comprehensive incident report.</w:t>
       </w:r>
     </w:p>
     <w:p>
@@ -598,16 +598,16 @@
           <w:ilvl w:val="0"/>
           <w:numId w:val="2"/>
         </w:numPr>
-        <w:spacing w:before="13" w:after="40"/>
-      </w:pPr>
-      <w:r>
-        <w:rPr>
-          <w:rFonts w:ascii="Source Sans Pro" w:eastAsia="Source Sans Pro" w:hAnsi="Source Sans Pro" w:cs="Source Sans Pro"/>
-          <w:color w:val="000000"/>
-          <w:sz w:val="19"/>
-          <w:szCs w:val="19"/>
-        </w:rPr>
-        <w:t>Built automated SOAR-style detection pipeline using Python and Splunk alerts.</w:t>
+        <w:spacing w:before="13" w:after="17"/>
+      </w:pPr>
+      <w:r>
+        <w:rPr>
+          <w:rFonts w:ascii="Source Sans Pro" w:eastAsia="Source Sans Pro" w:hAnsi="Source Sans Pro" w:cs="Source Sans Pro"/>
+          <w:color w:val="000000"/>
+          <w:sz w:val="19"/>
+          <w:szCs w:val="19"/>
+        </w:rPr>
+        <w:t>Developed automated SOAR (security orchestration and automation)-style detection pipeline using Python and Sigma rules (detection-as-code), performing TCP/IP analysis for detecting security threats and control gaps, resulting in a mapped MITRE ATT&amp;CK framework.</w:t>
       </w:r>
     </w:p>
     <w:p>
@@ -617,21 +617,21 @@
           <w:ilvl w:val="0"/>
           <w:numId w:val="2"/>
         </w:numPr>
-        <w:spacing w:before="13" w:after="40"/>
-      </w:pPr>
-      <w:r>
-        <w:rPr>
-          <w:rFonts w:ascii="Source Sans Pro" w:eastAsia="Source Sans Pro" w:hAnsi="Source Sans Pro" w:cs="Source Sans Pro"/>
-          <w:color w:val="000000"/>
-          <w:sz w:val="19"/>
-          <w:szCs w:val="19"/>
-        </w:rPr>
-        <w:t>Performed TCP/IP analysis in Wireshark to detect SYN scans, DNS tunnelling, and plaintext credential exposure on unencrypted sessions, and wrote PICERL incident report with risk risk arena context.</w:t>
-      </w:r>
-    </w:p>
-    <w:p>
-      <w:pPr>
-        <w:spacing w:before="32" w:after="32"/>
+        <w:spacing w:before="13" w:after="17"/>
+      </w:pPr>
+      <w:r>
+        <w:rPr>
+          <w:rFonts w:ascii="Source Sans Pro" w:eastAsia="Source Sans Pro" w:hAnsi="Source Sans Pro" w:cs="Source Sans Pro"/>
+          <w:color w:val="000000"/>
+          <w:sz w:val="19"/>
+          <w:szCs w:val="19"/>
+        </w:rPr>
+        <w:t>Built automated detection pipeline with SPL correlation (detection engineering) searches for brute-force detection, lateral movement, and privilege escalation, resulting in a PICERL incident report with risk identification and escalation priorities.</w:t>
+      </w:r>
+    </w:p>
+    <w:p>
+      <w:pPr>
+        <w:spacing w:before="5" w:after="5"/>
       </w:pPr>
     </w:p>
     <w:p>
@@ -688,16 +688,16 @@
           <w:ilvl w:val="0"/>
           <w:numId w:val="2"/>
         </w:numPr>
-        <w:spacing w:before="13" w:after="40"/>
-      </w:pPr>
-      <w:r>
-        <w:rPr>
-          <w:rFonts w:ascii="Source Sans Pro" w:eastAsia="Source Sans Pro" w:hAnsi="Source Sans Pro" w:cs="Source Sans Pro"/>
-          <w:color w:val="000000"/>
-          <w:sz w:val="19"/>
-          <w:szCs w:val="19"/>
-        </w:rPr>
-        <w:t>Built automated vulnerability assessment pipeline integrating Nessus and OpenVAS APIs in Python.</w:t>
+        <w:spacing w:before="13" w:after="17"/>
+      </w:pPr>
+      <w:r>
+        <w:rPr>
+          <w:rFonts w:ascii="Source Sans Pro" w:eastAsia="Source Sans Pro" w:hAnsi="Source Sans Pro" w:cs="Source Sans Pro"/>
+          <w:color w:val="000000"/>
+          <w:sz w:val="19"/>
+          <w:szCs w:val="19"/>
+        </w:rPr>
+        <w:t>Generated audit-ready CVE reports with CVSS severity (vulnerability prioritisation) and EPSS context, creating a risk-based vulnerability assessment for risk arena investors in Bengaluru, Karnataka, resulting in a prioritized remediation plan.</w:t>
       </w:r>
     </w:p>
     <w:p>
@@ -707,16 +707,16 @@
           <w:ilvl w:val="0"/>
           <w:numId w:val="2"/>
         </w:numPr>
-        <w:spacing w:before="13" w:after="40"/>
-      </w:pPr>
-      <w:r>
-        <w:rPr>
-          <w:rFonts w:ascii="Source Sans Pro" w:eastAsia="Source Sans Pro" w:hAnsi="Source Sans Pro" w:cs="Source Sans Pro"/>
-          <w:color w:val="000000"/>
-          <w:sz w:val="19"/>
-          <w:szCs w:val="19"/>
-        </w:rPr>
-        <w:t>Developed OWASP Top 10 automated compliance checker validating web application security controls against regulatory requirements.</w:t>
+        <w:spacing w:before="13" w:after="17"/>
+      </w:pPr>
+      <w:r>
+        <w:rPr>
+          <w:rFonts w:ascii="Source Sans Pro" w:eastAsia="Source Sans Pro" w:hAnsi="Source Sans Pro" w:cs="Source Sans Pro"/>
+          <w:color w:val="000000"/>
+          <w:sz w:val="19"/>
+          <w:szCs w:val="19"/>
+        </w:rPr>
+        <w:t>Developed OWASP Top 10 automated compliance checker for web application security, validating security controls against regulatory requirements and identifying risk, resulting in a compliance report with risk triage and remediation tracking.</w:t>
       </w:r>
     </w:p>
     <w:p>
@@ -726,16 +726,16 @@
           <w:ilvl w:val="0"/>
           <w:numId w:val="2"/>
         </w:numPr>
-        <w:spacing w:before="13" w:after="40"/>
-      </w:pPr>
-      <w:r>
-        <w:rPr>
-          <w:rFonts w:ascii="Source Sans Pro" w:eastAsia="Source Sans Pro" w:hAnsi="Source Sans Pro" w:cs="Source Sans Pro"/>
-          <w:color w:val="000000"/>
-          <w:sz w:val="19"/>
-          <w:szCs w:val="19"/>
-        </w:rPr>
-        <w:t>Automated compliance scan scheduling via Bash and cron, and built delta-scan logic to track remediation progress and organize audit evidence for.</w:t>
+        <w:spacing w:before="13" w:after="17"/>
+      </w:pPr>
+      <w:r>
+        <w:rPr>
+          <w:rFonts w:ascii="Source Sans Pro" w:eastAsia="Source Sans Pro" w:hAnsi="Source Sans Pro" w:cs="Source Sans Pro"/>
+          <w:color w:val="000000"/>
+          <w:sz w:val="19"/>
+          <w:szCs w:val="19"/>
+        </w:rPr>
+        <w:t>Automated compliance scan scheduling via Bash and cron, tracking remediation progress and organizing audit evidence for patch compliance (remediation tracking) review, resulting in a comprehensive risk management report with control gap analysis.</w:t>
       </w:r>
     </w:p>
     <w:p>
@@ -743,7 +743,7 @@
         <w:pBdr>
           <w:bottom w:val="single" w:sz="6" w:space="1" w:color="000000"/>
         </w:pBdr>
-        <w:spacing w:before="32" w:after="32"/>
+        <w:spacing w:before="5" w:after="5"/>
         <w:rPr>
           <w:rFonts w:ascii="Source Sans Pro" w:eastAsia="Source Sans Pro" w:hAnsi="Source Sans Pro" w:cs="Source Sans Pro"/>
           <w:b/>
@@ -759,7 +759,7 @@
         <w:pBdr>
           <w:bottom w:val="single" w:sz="6" w:space="1" w:color="000000"/>
         </w:pBdr>
-        <w:spacing w:before="148" w:after="0"/>
+        <w:spacing w:before="42" w:after="0"/>
       </w:pPr>
       <w:r>
         <w:rPr>
@@ -775,7 +775,7 @@
     </w:p>
     <w:p>
       <w:pPr>
-        <w:spacing w:before="77" w:after="77"/>
+        <w:spacing w:before="31" w:after="31"/>
       </w:pPr>
       <w:r>
         <w:rPr>
@@ -797,7 +797,7 @@
     </w:p>
     <w:p>
       <w:pPr>
-        <w:spacing w:before="77" w:after="77"/>
+        <w:spacing w:before="31" w:after="31"/>
       </w:pPr>
       <w:r>
         <w:rPr>
@@ -819,6 +819,28 @@
     </w:p>
     <w:p>
       <w:pPr>
+        <w:spacing w:before="31" w:after="31"/>
+      </w:pPr>
+      <w:r>
+        <w:rPr>
+          <w:rFonts w:ascii="Source Sans Pro" w:eastAsia="Source Sans Pro" w:hAnsi="Source Sans Pro" w:cs="Source Sans Pro"/>
+          <w:b/>
+          <w:sz w:val="19"/>
+          <w:szCs w:val="19"/>
+        </w:rPr>
+        <w:t xml:space="preserve">Investigation and Remediation: </w:t>
+      </w:r>
+      <w:r>
+        <w:rPr>
+          <w:rFonts w:ascii="Source Sans Pro" w:eastAsia="Source Sans Pro" w:hAnsi="Source Sans Pro" w:cs="Source Sans Pro"/>
+          <w:sz w:val="19"/>
+          <w:szCs w:val="19"/>
+        </w:rPr>
+        <w:t>root cause analysis, anomaly detection, corrective actions</w:t>
+      </w:r>
+    </w:p>
+    <w:p>
+      <w:pPr>
         <w:spacing w:before="24" w:after="24"/>
       </w:pPr>
       <w:r>
@@ -828,20 +850,20 @@
           <w:sz w:val="19"/>
           <w:szCs w:val="19"/>
         </w:rPr>
-        <w:t xml:space="preserve">Investigation and Root Cause Ana: </w:t>
-      </w:r>
-      <w:r>
-        <w:rPr>
-          <w:rFonts w:ascii="Source Sans Pro" w:eastAsia="Source Sans Pro" w:hAnsi="Source Sans Pro" w:cs="Source Sans Pro"/>
-          <w:sz w:val="19"/>
-          <w:szCs w:val="19"/>
-        </w:rPr>
-        <w:t>policy violations, anomalous patterns, escalation procedures</w:t>
-      </w:r>
-    </w:p>
-    <w:p>
-      <w:pPr>
-        <w:spacing w:before="24" w:after="24"/>
+        <w:t xml:space="preserve">Automation and Threat Detection: </w:t>
+      </w:r>
+      <w:r>
+        <w:rPr>
+          <w:rFonts w:ascii="Source Sans Pro" w:eastAsia="Source Sans Pro" w:hAnsi="Source Sans Pro" w:cs="Source Sans Pro"/>
+          <w:sz w:val="19"/>
+          <w:szCs w:val="19"/>
+        </w:rPr>
+        <w:t>Splunk SIEM, Python, Sigma rules, threat detection pipeline</w:t>
+      </w:r>
+    </w:p>
+    <w:p>
+      <w:pPr>
+        <w:spacing w:before="31" w:after="31"/>
       </w:pPr>
       <w:r>
         <w:rPr>
@@ -850,28 +872,6 @@
           <w:sz w:val="19"/>
           <w:szCs w:val="19"/>
         </w:rPr>
-        <w:t xml:space="preserve">Automation and Threat Detection: </w:t>
-      </w:r>
-      <w:r>
-        <w:rPr>
-          <w:rFonts w:ascii="Source Sans Pro" w:eastAsia="Source Sans Pro" w:hAnsi="Source Sans Pro" w:cs="Source Sans Pro"/>
-          <w:sz w:val="19"/>
-          <w:szCs w:val="19"/>
-        </w:rPr>
-        <w:t>Splunk SIEM, Python, MITRE ATT&amp;CK, Sigma rules</w:t>
-      </w:r>
-    </w:p>
-    <w:p>
-      <w:pPr>
-        <w:spacing w:before="77" w:after="77"/>
-      </w:pPr>
-      <w:r>
-        <w:rPr>
-          <w:rFonts w:ascii="Source Sans Pro" w:eastAsia="Source Sans Pro" w:hAnsi="Source Sans Pro" w:cs="Source Sans Pro"/>
-          <w:b/>
-          <w:sz w:val="19"/>
-          <w:szCs w:val="19"/>
-        </w:rPr>
         <w:t xml:space="preserve">Vulnerability Assessment: </w:t>
       </w:r>
       <w:r>
@@ -880,7 +880,7 @@
           <w:sz w:val="19"/>
           <w:szCs w:val="19"/>
         </w:rPr>
-        <w:t>Nessus, OpenVAS, CVSS severity, EPSS context</w:t>
+        <w:t>Nessus, OpenVAS, CVSS severity, patch prioritization</w:t>
       </w:r>
     </w:p>
     <w:p>
@@ -888,7 +888,7 @@
         <w:pBdr>
           <w:bottom w:val="single" w:sz="6" w:space="1" w:color="000000"/>
         </w:pBdr>
-        <w:spacing w:before="32" w:after="32"/>
+        <w:spacing w:before="5" w:after="5"/>
         <w:rPr>
           <w:rFonts w:ascii="Source Sans Pro" w:eastAsia="Source Sans Pro" w:hAnsi="Source Sans Pro" w:cs="Source Sans Pro"/>
           <w:b/>
@@ -904,7 +904,7 @@
         <w:pBdr>
           <w:bottom w:val="single" w:sz="6" w:space="1" w:color="000000"/>
         </w:pBdr>
-        <w:spacing w:before="148" w:after="0"/>
+        <w:spacing w:before="42" w:after="0"/>
       </w:pPr>
       <w:r>
         <w:rPr>
@@ -925,7 +925,7 @@
           <w:ilvl w:val="0"/>
           <w:numId w:val="2"/>
         </w:numPr>
-        <w:spacing w:before="13" w:after="40"/>
+        <w:spacing w:before="13" w:after="17"/>
       </w:pPr>
       <w:r>
         <w:rPr>
@@ -944,7 +944,7 @@
           <w:ilvl w:val="0"/>
           <w:numId w:val="2"/>
         </w:numPr>
-        <w:spacing w:before="13" w:after="40"/>
+        <w:spacing w:before="13" w:after="17"/>
       </w:pPr>
       <w:r>
         <w:rPr>

</xml_diff>